<commit_message>
Node A 的 7 类 Fault Detection Scope Node B 的 6 类 Fault Detection / Fault Aggregation Scope Detection Enable Condition、Inhibition、Qualification / Debounce 等通用检测原则 无效 Sensor / Feedback 不得继续无条件参与控制或诊断 严重本地故障由 Node A 自主保护，不依赖 CAN Fault Dependency / Suppression / Arbitration 原则 Node B 不重复实现 A 的本地检测，而负责系统上下文关联和 Fault Aggregation 正式 Fault List v0.1 仍然保持 TBD 阈值、Qualification 时间、Recovery、Severity、Reaction、DTC、System State 等全部继续保持 TBD “Recommended Next Steps” 更新为下一步进入 Fault → System State / Reaction
</commit_message>
<xml_diff>
--- a/System_Architecture_Definition_v0.1.docx
+++ b/System_Architecture_Definition_v0.1.docx
@@ -5688,7 +5688,7 @@
           <w:b w:val="0"/>
           <w:sz w:val="21"/>
         </w:rPr>
-        <w:t>本节当前仅冻结 Fault Management 的原则与框架，正式 Fault List v0.1 尚未建立。后续必须按“检测者、故障确认、系统影响、恢复策略、DTC/上报”逐条定义。</w:t>
+        <w:t>本节当前已冻结 Node A / Node B 的 Fault Detection 范围、检测/管理责任边界以及通用故障检测原则；正式 Fault List v0.1 仍未建立。后续仍需按“检测条件、Qualification / Debounce、Recovery、Reaction、DTC/上报、系统状态影响”逐条完成。</w:t>
       </w:r>
     </w:p>
     <w:tbl>
@@ -5784,17 +5784,8 @@
             </w:tcMar>
           </w:tcPr>
           <w:p>
-            <w:pPr>
-              <w:jc w:val="center"/>
-            </w:pPr>
-            <w:r>
-              <w:rPr>
-                <w:rFonts w:ascii="Noto Sans CJK SC" w:hAnsi="Noto Sans CJK SC" w:eastAsia="Noto Sans CJK SC"/>
-                <w:b/>
-                <w:color w:val="FFFFFF"/>
-                <w:sz w:val="18"/>
-              </w:rPr>
-              <w:t>候选 Fault</w:t>
+            <w:r>
+              <w:t>Fault Detection Scope</w:t>
             </w:r>
           </w:p>
         </w:tc>
@@ -5810,17 +5801,8 @@
             </w:tcMar>
           </w:tcPr>
           <w:p>
-            <w:pPr>
-              <w:jc w:val="center"/>
-            </w:pPr>
-            <w:r>
-              <w:rPr>
-                <w:rFonts w:ascii="Noto Sans CJK SC" w:hAnsi="Noto Sans CJK SC" w:eastAsia="Noto Sans CJK SC"/>
-                <w:b/>
-                <w:color w:val="FFFFFF"/>
-                <w:sz w:val="18"/>
-              </w:rPr>
-              <w:t>初步检测方</w:t>
+            <w:r>
+              <w:t>Detection / Management Owner</w:t>
             </w:r>
           </w:p>
         </w:tc>
@@ -5836,22 +5818,16 @@
             </w:tcMar>
           </w:tcPr>
           <w:p>
-            <w:pPr>
-              <w:jc w:val="center"/>
-            </w:pPr>
-            <w:r>
-              <w:rPr>
-                <w:rFonts w:ascii="Noto Sans CJK SC" w:hAnsi="Noto Sans CJK SC" w:eastAsia="Noto Sans CJK SC"/>
-                <w:b/>
-                <w:color w:val="FFFFFF"/>
-                <w:sz w:val="18"/>
-              </w:rPr>
+            <w:r>
               <w:t>当前状态</w:t>
             </w:r>
           </w:p>
         </w:tc>
       </w:tr>
       <w:tr>
+        <w:trPr>
+          <w:cantSplit/>
+        </w:trPr>
         <w:tc>
           <w:tcPr>
             <w:tcW w:type="dxa" w:w="3331"/>
@@ -5864,16 +5840,8 @@
             <w:vAlign w:val="center"/>
           </w:tcPr>
           <w:p>
-            <w:pPr>
-              <w:spacing w:after="0"/>
-            </w:pPr>
-            <w:r>
-              <w:rPr>
-                <w:rFonts w:ascii="Noto Sans CJK SC" w:hAnsi="Noto Sans CJK SC" w:eastAsia="Noto Sans CJK SC"/>
-                <w:b w:val="0"/>
-                <w:sz w:val="18"/>
-              </w:rPr>
-              <w:t>Fan Stall</w:t>
+            <w:r>
+              <w:t>FA-01 Fan Stall</w:t>
             </w:r>
           </w:p>
         </w:tc>
@@ -5889,15 +5857,7 @@
             <w:vAlign w:val="center"/>
           </w:tcPr>
           <w:p>
-            <w:pPr>
-              <w:spacing w:after="0"/>
-            </w:pPr>
-            <w:r>
-              <w:rPr>
-                <w:rFonts w:ascii="Noto Sans CJK SC" w:hAnsi="Noto Sans CJK SC" w:eastAsia="Noto Sans CJK SC"/>
-                <w:b w:val="0"/>
-                <w:sz w:val="18"/>
-              </w:rPr>
+            <w:r>
               <w:t>Node A</w:t>
             </w:r>
           </w:p>
@@ -5914,21 +5874,16 @@
             <w:vAlign w:val="center"/>
           </w:tcPr>
           <w:p>
-            <w:pPr>
-              <w:spacing w:after="0"/>
-            </w:pPr>
-            <w:r>
-              <w:rPr>
-                <w:rFonts w:ascii="Noto Sans CJK SC" w:hAnsi="Noto Sans CJK SC" w:eastAsia="Noto Sans CJK SC"/>
-                <w:b w:val="0"/>
-                <w:sz w:val="18"/>
-              </w:rPr>
-              <w:t>Candidate / 待 Fault List</w:t>
+            <w:r>
+              <w:t>BASELINE detection scope；阈值 / Qualification / Recovery TBD</w:t>
             </w:r>
           </w:p>
         </w:tc>
       </w:tr>
       <w:tr>
+        <w:trPr>
+          <w:cantSplit/>
+        </w:trPr>
         <w:tc>
           <w:tcPr>
             <w:tcW w:type="dxa" w:w="3331"/>
@@ -5941,16 +5896,8 @@
             <w:vAlign w:val="center"/>
           </w:tcPr>
           <w:p>
-            <w:pPr>
-              <w:spacing w:after="0"/>
-            </w:pPr>
-            <w:r>
-              <w:rPr>
-                <w:rFonts w:ascii="Noto Sans CJK SC" w:hAnsi="Noto Sans CJK SC" w:eastAsia="Noto Sans CJK SC"/>
-                <w:b w:val="0"/>
-                <w:sz w:val="18"/>
-              </w:rPr>
-              <w:t>Speed Deviation</w:t>
+            <w:r>
+              <w:t>FA-02 Fan Speed Deviation</w:t>
             </w:r>
           </w:p>
         </w:tc>
@@ -5966,15 +5913,7 @@
             <w:vAlign w:val="center"/>
           </w:tcPr>
           <w:p>
-            <w:pPr>
-              <w:spacing w:after="0"/>
-            </w:pPr>
-            <w:r>
-              <w:rPr>
-                <w:rFonts w:ascii="Noto Sans CJK SC" w:hAnsi="Noto Sans CJK SC" w:eastAsia="Noto Sans CJK SC"/>
-                <w:b w:val="0"/>
-                <w:sz w:val="18"/>
-              </w:rPr>
+            <w:r>
               <w:t>Node A</w:t>
             </w:r>
           </w:p>
@@ -5991,21 +5930,16 @@
             <w:vAlign w:val="center"/>
           </w:tcPr>
           <w:p>
-            <w:pPr>
-              <w:spacing w:after="0"/>
-            </w:pPr>
-            <w:r>
-              <w:rPr>
-                <w:rFonts w:ascii="Noto Sans CJK SC" w:hAnsi="Noto Sans CJK SC" w:eastAsia="Noto Sans CJK SC"/>
-                <w:b w:val="0"/>
-                <w:sz w:val="18"/>
-              </w:rPr>
-              <w:t>Candidate / 待 Fault List</w:t>
+            <w:r>
+              <w:t>BASELINE detection scope；阈值 / Qualification / Recovery TBD</w:t>
             </w:r>
           </w:p>
         </w:tc>
       </w:tr>
       <w:tr>
+        <w:trPr>
+          <w:cantSplit/>
+        </w:trPr>
         <w:tc>
           <w:tcPr>
             <w:tcW w:type="dxa" w:w="3331"/>
@@ -6018,16 +5952,8 @@
             <w:vAlign w:val="center"/>
           </w:tcPr>
           <w:p>
-            <w:pPr>
-              <w:spacing w:after="0"/>
-            </w:pPr>
-            <w:r>
-              <w:rPr>
-                <w:rFonts w:ascii="Noto Sans CJK SC" w:hAnsi="Noto Sans CJK SC" w:eastAsia="Noto Sans CJK SC"/>
-                <w:b w:val="0"/>
-                <w:sz w:val="18"/>
-              </w:rPr>
-              <w:t>RPM Feedback Lost / Invalid</w:t>
+            <w:r>
+              <w:t>FA-03 RPM Feedback Fault</w:t>
             </w:r>
           </w:p>
         </w:tc>
@@ -6043,15 +5969,7 @@
             <w:vAlign w:val="center"/>
           </w:tcPr>
           <w:p>
-            <w:pPr>
-              <w:spacing w:after="0"/>
-            </w:pPr>
-            <w:r>
-              <w:rPr>
-                <w:rFonts w:ascii="Noto Sans CJK SC" w:hAnsi="Noto Sans CJK SC" w:eastAsia="Noto Sans CJK SC"/>
-                <w:b w:val="0"/>
-                <w:sz w:val="18"/>
-              </w:rPr>
+            <w:r>
               <w:t>Node A</w:t>
             </w:r>
           </w:p>
@@ -6068,21 +5986,16 @@
             <w:vAlign w:val="center"/>
           </w:tcPr>
           <w:p>
-            <w:pPr>
-              <w:spacing w:after="0"/>
-            </w:pPr>
-            <w:r>
-              <w:rPr>
-                <w:rFonts w:ascii="Noto Sans CJK SC" w:hAnsi="Noto Sans CJK SC" w:eastAsia="Noto Sans CJK SC"/>
-                <w:b w:val="0"/>
-                <w:sz w:val="18"/>
-              </w:rPr>
-              <w:t>Candidate / 待 Fault List</w:t>
+            <w:r>
+              <w:t>BASELINE detection scope；Plausibility / fallback TBD</w:t>
             </w:r>
           </w:p>
         </w:tc>
       </w:tr>
       <w:tr>
+        <w:trPr>
+          <w:cantSplit/>
+        </w:trPr>
         <w:tc>
           <w:tcPr>
             <w:tcW w:type="dxa" w:w="3331"/>
@@ -6095,16 +6008,8 @@
             <w:vAlign w:val="center"/>
           </w:tcPr>
           <w:p>
-            <w:pPr>
-              <w:spacing w:after="0"/>
-            </w:pPr>
-            <w:r>
-              <w:rPr>
-                <w:rFonts w:ascii="Noto Sans CJK SC" w:hAnsi="Noto Sans CJK SC" w:eastAsia="Noto Sans CJK SC"/>
-                <w:b w:val="0"/>
-                <w:sz w:val="18"/>
-              </w:rPr>
-              <w:t>Motor Overcurrent</w:t>
+            <w:r>
+              <w:t>FA-04 Motor Overcurrent</w:t>
             </w:r>
           </w:p>
         </w:tc>
@@ -6120,15 +6025,7 @@
             <w:vAlign w:val="center"/>
           </w:tcPr>
           <w:p>
-            <w:pPr>
-              <w:spacing w:after="0"/>
-            </w:pPr>
-            <w:r>
-              <w:rPr>
-                <w:rFonts w:ascii="Noto Sans CJK SC" w:hAnsi="Noto Sans CJK SC" w:eastAsia="Noto Sans CJK SC"/>
-                <w:b w:val="0"/>
-                <w:sz w:val="18"/>
-              </w:rPr>
+            <w:r>
               <w:t>Node A</w:t>
             </w:r>
           </w:p>
@@ -6145,21 +6042,16 @@
             <w:vAlign w:val="center"/>
           </w:tcPr>
           <w:p>
-            <w:pPr>
-              <w:spacing w:after="0"/>
-            </w:pPr>
-            <w:r>
-              <w:rPr>
-                <w:rFonts w:ascii="Noto Sans CJK SC" w:hAnsi="Noto Sans CJK SC" w:eastAsia="Noto Sans CJK SC"/>
-                <w:b w:val="0"/>
-                <w:sz w:val="18"/>
-              </w:rPr>
-              <w:t>Candidate / 待 Fault List</w:t>
+            <w:r>
+              <w:t>BASELINE detection scope；warning / protection thresholds TBD</w:t>
             </w:r>
           </w:p>
         </w:tc>
       </w:tr>
       <w:tr>
+        <w:trPr>
+          <w:cantSplit/>
+        </w:trPr>
         <w:tc>
           <w:tcPr>
             <w:tcW w:type="dxa" w:w="3331"/>
@@ -6172,16 +6064,8 @@
             <w:vAlign w:val="center"/>
           </w:tcPr>
           <w:p>
-            <w:pPr>
-              <w:spacing w:after="0"/>
-            </w:pPr>
-            <w:r>
-              <w:rPr>
-                <w:rFonts w:ascii="Noto Sans CJK SC" w:hAnsi="Noto Sans CJK SC" w:eastAsia="Noto Sans CJK SC"/>
-                <w:b w:val="0"/>
-                <w:sz w:val="18"/>
-              </w:rPr>
-              <w:t>Supply Undervoltage / Overvoltage</w:t>
+            <w:r>
+              <w:t>FA-05 Current Feedback Fault</w:t>
             </w:r>
           </w:p>
         </w:tc>
@@ -6197,15 +6081,7 @@
             <w:vAlign w:val="center"/>
           </w:tcPr>
           <w:p>
-            <w:pPr>
-              <w:spacing w:after="0"/>
-            </w:pPr>
-            <w:r>
-              <w:rPr>
-                <w:rFonts w:ascii="Noto Sans CJK SC" w:hAnsi="Noto Sans CJK SC" w:eastAsia="Noto Sans CJK SC"/>
-                <w:b w:val="0"/>
-                <w:sz w:val="18"/>
-              </w:rPr>
+            <w:r>
               <w:t>Node A</w:t>
             </w:r>
           </w:p>
@@ -6222,21 +6098,16 @@
             <w:vAlign w:val="center"/>
           </w:tcPr>
           <w:p>
-            <w:pPr>
-              <w:spacing w:after="0"/>
-            </w:pPr>
-            <w:r>
-              <w:rPr>
-                <w:rFonts w:ascii="Noto Sans CJK SC" w:hAnsi="Noto Sans CJK SC" w:eastAsia="Noto Sans CJK SC"/>
-                <w:b w:val="0"/>
-                <w:sz w:val="18"/>
-              </w:rPr>
-              <w:t>Candidate，取决于是否纳入 Voltage Signal</w:t>
+            <w:r>
+              <w:t>BASELINE detection scope；Plausibility / degraded diagnostics TBD</w:t>
             </w:r>
           </w:p>
         </w:tc>
       </w:tr>
       <w:tr>
+        <w:trPr>
+          <w:cantSplit/>
+        </w:trPr>
         <w:tc>
           <w:tcPr>
             <w:tcW w:type="dxa" w:w="3331"/>
@@ -6249,16 +6120,8 @@
             <w:vAlign w:val="center"/>
           </w:tcPr>
           <w:p>
-            <w:pPr>
-              <w:spacing w:after="0"/>
-            </w:pPr>
-            <w:r>
-              <w:rPr>
-                <w:rFonts w:ascii="Noto Sans CJK SC" w:hAnsi="Noto Sans CJK SC" w:eastAsia="Noto Sans CJK SC"/>
-                <w:b w:val="0"/>
-                <w:sz w:val="18"/>
-              </w:rPr>
-              <w:t>System Overtemperature</w:t>
+            <w:r>
+              <w:t>FA-06 Supply Undervoltage / Overvoltage</w:t>
             </w:r>
           </w:p>
         </w:tc>
@@ -6274,16 +6137,8 @@
             <w:vAlign w:val="center"/>
           </w:tcPr>
           <w:p>
-            <w:pPr>
-              <w:spacing w:after="0"/>
-            </w:pPr>
-            <w:r>
-              <w:rPr>
-                <w:rFonts w:ascii="Noto Sans CJK SC" w:hAnsi="Noto Sans CJK SC" w:eastAsia="Noto Sans CJK SC"/>
-                <w:b w:val="0"/>
-                <w:sz w:val="18"/>
-              </w:rPr>
-              <w:t>Node B</w:t>
+            <w:r>
+              <w:t>Node A</w:t>
             </w:r>
           </w:p>
         </w:tc>
@@ -6299,21 +6154,16 @@
             <w:vAlign w:val="center"/>
           </w:tcPr>
           <w:p>
-            <w:pPr>
-              <w:spacing w:after="0"/>
-            </w:pPr>
-            <w:r>
-              <w:rPr>
-                <w:rFonts w:ascii="Noto Sans CJK SC" w:hAnsi="Noto Sans CJK SC" w:eastAsia="Noto Sans CJK SC"/>
-                <w:b w:val="0"/>
-                <w:sz w:val="18"/>
-              </w:rPr>
-              <w:t>Candidate / 待 Fault List</w:t>
+            <w:r>
+              <w:t>BASELINE fault family；是否纳入 v0.1 仍取决于 OI-04</w:t>
             </w:r>
           </w:p>
         </w:tc>
       </w:tr>
       <w:tr>
+        <w:trPr>
+          <w:cantSplit/>
+        </w:trPr>
         <w:tc>
           <w:tcPr>
             <w:tcW w:type="dxa" w:w="3331"/>
@@ -6326,16 +6176,8 @@
             <w:vAlign w:val="center"/>
           </w:tcPr>
           <w:p>
-            <w:pPr>
-              <w:spacing w:after="0"/>
-            </w:pPr>
-            <w:r>
-              <w:rPr>
-                <w:rFonts w:ascii="Noto Sans CJK SC" w:hAnsi="Noto Sans CJK SC" w:eastAsia="Noto Sans CJK SC"/>
-                <w:b w:val="0"/>
-                <w:sz w:val="18"/>
-              </w:rPr>
-              <w:t>Node A Command Timeout</w:t>
+            <w:r>
+              <w:t>FA-07 Cooling Demand Communication Fault</w:t>
             </w:r>
           </w:p>
         </w:tc>
@@ -6351,16 +6193,8 @@
             <w:vAlign w:val="center"/>
           </w:tcPr>
           <w:p>
-            <w:pPr>
-              <w:spacing w:after="0"/>
-            </w:pPr>
-            <w:r>
-              <w:rPr>
-                <w:rFonts w:ascii="Noto Sans CJK SC" w:hAnsi="Noto Sans CJK SC" w:eastAsia="Noto Sans CJK SC"/>
-                <w:b w:val="0"/>
-                <w:sz w:val="18"/>
-              </w:rPr>
-              <w:t>Node A</w:t>
+            <w:r>
+              <w:t>Node A（接收方）</w:t>
             </w:r>
           </w:p>
         </w:tc>
@@ -6376,21 +6210,16 @@
             <w:vAlign w:val="center"/>
           </w:tcPr>
           <w:p>
-            <w:pPr>
-              <w:spacing w:after="0"/>
-            </w:pPr>
-            <w:r>
-              <w:rPr>
-                <w:rFonts w:ascii="Noto Sans CJK SC" w:hAnsi="Noto Sans CJK SC" w:eastAsia="Noto Sans CJK SC"/>
-                <w:b w:val="0"/>
-                <w:sz w:val="18"/>
-              </w:rPr>
-              <w:t>Candidate / CAN Architecture 后细化</w:t>
+            <w:r>
+              <w:t>BASELINE detection scope；Timeout / Alive / validity 规则 TBD</w:t>
             </w:r>
           </w:p>
         </w:tc>
       </w:tr>
       <w:tr>
+        <w:trPr>
+          <w:cantSplit/>
+        </w:trPr>
         <w:tc>
           <w:tcPr>
             <w:tcW w:type="dxa" w:w="3331"/>
@@ -6403,16 +6232,8 @@
             <w:vAlign w:val="center"/>
           </w:tcPr>
           <w:p>
-            <w:pPr>
-              <w:spacing w:after="0"/>
-            </w:pPr>
-            <w:r>
-              <w:rPr>
-                <w:rFonts w:ascii="Noto Sans CJK SC" w:hAnsi="Noto Sans CJK SC" w:eastAsia="Noto Sans CJK SC"/>
-                <w:b w:val="0"/>
-                <w:sz w:val="18"/>
-              </w:rPr>
-              <w:t>Node A Communication Loss / Heartbeat Timeout</w:t>
+            <w:r>
+              <w:t>FB-01 Overtemperature</w:t>
             </w:r>
           </w:p>
         </w:tc>
@@ -6428,15 +6249,7 @@
             <w:vAlign w:val="center"/>
           </w:tcPr>
           <w:p>
-            <w:pPr>
-              <w:spacing w:after="0"/>
-            </w:pPr>
-            <w:r>
-              <w:rPr>
-                <w:rFonts w:ascii="Noto Sans CJK SC" w:hAnsi="Noto Sans CJK SC" w:eastAsia="Noto Sans CJK SC"/>
-                <w:b w:val="0"/>
-                <w:sz w:val="18"/>
-              </w:rPr>
+            <w:r>
               <w:t>Node B</w:t>
             </w:r>
           </w:p>
@@ -6453,21 +6266,16 @@
             <w:vAlign w:val="center"/>
           </w:tcPr>
           <w:p>
-            <w:pPr>
-              <w:spacing w:after="0"/>
-            </w:pPr>
-            <w:r>
-              <w:rPr>
-                <w:rFonts w:ascii="Noto Sans CJK SC" w:hAnsi="Noto Sans CJK SC" w:eastAsia="Noto Sans CJK SC"/>
-                <w:b w:val="0"/>
-                <w:sz w:val="18"/>
-              </w:rPr>
-              <w:t>Candidate / CAN Architecture 后细化</w:t>
+            <w:r>
+              <w:t>BASELINE detection scope；阈值 / Hysteresis / Qualification TBD</w:t>
             </w:r>
           </w:p>
         </w:tc>
       </w:tr>
       <w:tr>
+        <w:trPr>
+          <w:cantSplit/>
+        </w:trPr>
         <w:tc>
           <w:tcPr>
             <w:tcW w:type="dxa" w:w="3331"/>
@@ -6480,16 +6288,8 @@
             <w:vAlign w:val="center"/>
           </w:tcPr>
           <w:p>
-            <w:pPr>
-              <w:spacing w:after="0"/>
-            </w:pPr>
-            <w:r>
-              <w:rPr>
-                <w:rFonts w:ascii="Noto Sans CJK SC" w:hAnsi="Noto Sans CJK SC" w:eastAsia="Noto Sans CJK SC"/>
-                <w:b w:val="0"/>
-                <w:sz w:val="18"/>
-              </w:rPr>
-              <w:t>Alive Counter Error</w:t>
+            <w:r>
+              <w:t>FB-02 Insufficient Cooling Performance</w:t>
             </w:r>
           </w:p>
         </w:tc>
@@ -6505,16 +6305,8 @@
             <w:vAlign w:val="center"/>
           </w:tcPr>
           <w:p>
-            <w:pPr>
-              <w:spacing w:after="0"/>
-            </w:pPr>
-            <w:r>
-              <w:rPr>
-                <w:rFonts w:ascii="Noto Sans CJK SC" w:hAnsi="Noto Sans CJK SC" w:eastAsia="Noto Sans CJK SC"/>
-                <w:b w:val="0"/>
-                <w:sz w:val="18"/>
-              </w:rPr>
-              <w:t>Node B / 接收方</w:t>
+            <w:r>
+              <w:t>Node B</w:t>
             </w:r>
           </w:p>
         </w:tc>
@@ -6530,16 +6322,148 @@
             <w:vAlign w:val="center"/>
           </w:tcPr>
           <w:p>
-            <w:pPr>
-              <w:spacing w:after="0"/>
-            </w:pPr>
-            <w:r>
-              <w:rPr>
-                <w:rFonts w:ascii="Noto Sans CJK SC" w:hAnsi="Noto Sans CJK SC" w:eastAsia="Noto Sans CJK SC"/>
-                <w:b w:val="0"/>
-                <w:sz w:val="18"/>
-              </w:rPr>
-              <w:t>Candidate / CAN Architecture 后细化</w:t>
+            <w:r>
+              <w:t>BASELINE detection scope；性能判据 / observation window TBD</w:t>
+            </w:r>
+          </w:p>
+        </w:tc>
+      </w:tr>
+      <w:tr>
+        <w:trPr>
+          <w:cantSplit/>
+        </w:trPr>
+        <w:tc>
+          <w:tcPr>
+            <w:tcW w:type="dxa" w:w="3331"/>
+          </w:tcPr>
+          <w:p>
+            <w:r>
+              <w:t>FB-03 Node A Communication Timeout</w:t>
+            </w:r>
+          </w:p>
+        </w:tc>
+        <w:tc>
+          <w:tcPr>
+            <w:tcW w:type="dxa" w:w="3331"/>
+          </w:tcPr>
+          <w:p>
+            <w:r>
+              <w:t>Node B（接收方）</w:t>
+            </w:r>
+          </w:p>
+        </w:tc>
+        <w:tc>
+          <w:tcPr>
+            <w:tcW w:type="dxa" w:w="3331"/>
+          </w:tcPr>
+          <w:p>
+            <w:r>
+              <w:t>BASELINE detection scope；Timeout 参数 TBD</w:t>
+            </w:r>
+          </w:p>
+        </w:tc>
+      </w:tr>
+      <w:tr>
+        <w:trPr>
+          <w:cantSplit/>
+        </w:trPr>
+        <w:tc>
+          <w:tcPr>
+            <w:tcW w:type="dxa" w:w="3331"/>
+          </w:tcPr>
+          <w:p>
+            <w:r>
+              <w:t>FB-04 Node A Alive Counter / Message Sequence Fault</w:t>
+            </w:r>
+          </w:p>
+        </w:tc>
+        <w:tc>
+          <w:tcPr>
+            <w:tcW w:type="dxa" w:w="3331"/>
+          </w:tcPr>
+          <w:p>
+            <w:r>
+              <w:t>Node B（接收方）</w:t>
+            </w:r>
+          </w:p>
+        </w:tc>
+        <w:tc>
+          <w:tcPr>
+            <w:tcW w:type="dxa" w:w="3331"/>
+          </w:tcPr>
+          <w:p>
+            <w:r>
+              <w:t>BASELINE detection scope；Counter / sequence 规则 TBD</w:t>
+            </w:r>
+          </w:p>
+        </w:tc>
+      </w:tr>
+      <w:tr>
+        <w:trPr>
+          <w:cantSplit/>
+        </w:trPr>
+        <w:tc>
+          <w:tcPr>
+            <w:tcW w:type="dxa" w:w="3331"/>
+          </w:tcPr>
+          <w:p>
+            <w:r>
+              <w:t>FB-05 Node A Reported Actuator Fault</w:t>
+            </w:r>
+          </w:p>
+        </w:tc>
+        <w:tc>
+          <w:tcPr>
+            <w:tcW w:type="dxa" w:w="3331"/>
+          </w:tcPr>
+          <w:p>
+            <w:r>
+              <w:t>Node B（System Fault Manager）</w:t>
+            </w:r>
+          </w:p>
+        </w:tc>
+        <w:tc>
+          <w:tcPr>
+            <w:tcW w:type="dxa" w:w="3331"/>
+          </w:tcPr>
+          <w:p>
+            <w:r>
+              <w:t>BASELINE propagation / aggregation responsibility；severity handling TBD</w:t>
+            </w:r>
+          </w:p>
+        </w:tc>
+      </w:tr>
+      <w:tr>
+        <w:trPr>
+          <w:cantSplit/>
+        </w:trPr>
+        <w:tc>
+          <w:tcPr>
+            <w:tcW w:type="dxa" w:w="3331"/>
+          </w:tcPr>
+          <w:p>
+            <w:r>
+              <w:t>FB-06 Temperature Signal Fault</w:t>
+            </w:r>
+          </w:p>
+        </w:tc>
+        <w:tc>
+          <w:tcPr>
+            <w:tcW w:type="dxa" w:w="3331"/>
+          </w:tcPr>
+          <w:p>
+            <w:r>
+              <w:t>Node B</w:t>
+            </w:r>
+          </w:p>
+        </w:tc>
+        <w:tc>
+          <w:tcPr>
+            <w:tcW w:type="dxa" w:w="3331"/>
+          </w:tcPr>
+          <w:p>
+            <w:r>
+              <w:t>BASELINE detection scope；Plausibility / fallback strategy TBD</w:t>
             </w:r>
           </w:p>
         </w:tc>
@@ -6576,38 +6500,18 @@
             <w:shd w:fill="E7F3EC"/>
           </w:tcPr>
           <w:p>
-            <w:pPr>
-              <w:spacing w:after="80"/>
-            </w:pPr>
-            <w:r>
-              <w:rPr>
-                <w:rFonts w:ascii="Noto Sans CJK SC" w:hAnsi="Noto Sans CJK SC" w:eastAsia="Noto Sans CJK SC"/>
-                <w:b/>
-                <w:color w:val="16324F"/>
-                <w:sz w:val="21"/>
-              </w:rPr>
-              <w:t>Fault Detection 责任遵循“本地问题本地检测”  [BASELINE]</w:t>
-            </w:r>
-          </w:p>
-          <w:p>
-            <w:pPr>
-              <w:spacing w:after="40"/>
-            </w:pPr>
-            <w:r>
-              <w:rPr>
-                <w:rFonts w:ascii="Noto Sans CJK SC" w:hAnsi="Noto Sans CJK SC" w:eastAsia="Noto Sans CJK SC"/>
-                <w:b/>
-                <w:sz w:val="21"/>
-              </w:rPr>
-              <w:t>设计依据：</w:t>
-            </w:r>
-            <w:r>
-              <w:rPr>
-                <w:rFonts w:ascii="Noto Sans CJK SC" w:hAnsi="Noto Sans CJK SC" w:eastAsia="Noto Sans CJK SC"/>
-                <w:b w:val="0"/>
-                <w:sz w:val="21"/>
-              </w:rPr>
-              <w:t>Node A 最接近风扇、RPM、Current 和驱动状态，因此执行器本地 Fault 由 Node A 首先检测最合理；Node B 负责系统热状态与节点级监督。</w:t>
+            <w:r>
+              <w:t>Fault Detection 责任与通用原则  [BASELINE]</w:t>
+              <w:br/>
+              <w:t>设计依据：Node A 最接近风扇、RPM、Current 和驱动状态，因此执行器本地 Fault 由 Node A 首先检测；Node B 负责系统热状态、节点监督、跨 ECU 关联与系统级 Fault Aggregation。</w:t>
+              <w:br/>
+              <w:t>检测原则：每个 Fault 应定义 Detection Enable Condition；启动/瞬态等不适用阶段允许 Inhibition；除需要立即保护的严重故障外，异常应经过 Qualification / Debounce 后再确认。</w:t>
+              <w:br/>
+              <w:t>信号原则：确认无效的 Sensor / Feedback Signal 不得继续被无条件用于闭环控制或依赖该信号的诊断逻辑。</w:t>
+              <w:br/>
+              <w:t>保护原则：严重本地机械/电气故障允许 Node A 不依赖 CAN 自主进入安全输出，并随后向 Node B 上报。</w:t>
+              <w:br/>
+              <w:t>关联原则：Fault 之间应支持 Dependency / Suppression / Arbitration，避免把后果故障与根因故障无差别并列。Node B 不重复实现 Node A 的全部本地检测算法，而是接收本地 Fault Status 并结合 Temperature、Cooling Demand、Node A Availability 等系统上下文进行管理。</w:t>
             </w:r>
           </w:p>
         </w:tc>
@@ -6644,38 +6548,10 @@
             <w:shd w:fill="FFF4D6"/>
           </w:tcPr>
           <w:p>
-            <w:pPr>
-              <w:spacing w:after="80"/>
-            </w:pPr>
-            <w:r>
-              <w:rPr>
-                <w:rFonts w:ascii="Noto Sans CJK SC" w:hAnsi="Noto Sans CJK SC" w:eastAsia="Noto Sans CJK SC"/>
-                <w:b/>
-                <w:color w:val="16324F"/>
-                <w:sz w:val="21"/>
-              </w:rPr>
+            <w:r>
               <w:t>正式 Fault List v0.1  [TBD]</w:t>
-            </w:r>
-          </w:p>
-          <w:p>
-            <w:pPr>
-              <w:spacing w:after="40"/>
-            </w:pPr>
-            <w:r>
-              <w:rPr>
-                <w:rFonts w:ascii="Noto Sans CJK SC" w:hAnsi="Noto Sans CJK SC" w:eastAsia="Noto Sans CJK SC"/>
-                <w:b/>
-                <w:sz w:val="21"/>
-              </w:rPr>
-              <w:t>设计依据：</w:t>
-            </w:r>
-            <w:r>
-              <w:rPr>
-                <w:rFonts w:ascii="Noto Sans CJK SC" w:hAnsi="Noto Sans CJK SC" w:eastAsia="Noto Sans CJK SC"/>
-                <w:b w:val="0"/>
-                <w:sz w:val="21"/>
-              </w:rPr>
-              <w:t>当前列出的 Fault 仍是候选集合。正式 Fault List 需要定义 Fault ID、检测条件、Qualification、Debounce、Recovery、Reaction、DTC 归属、对系统 State 的影响。</w:t>
+              <w:br/>
+              <w:t>设计依据：当前已冻结的是 Node A / Node B 的 Fault Detection Scope、Owner 与通用检测原则，这还不等于正式 Fault List。正式版本仍需为每个 Fault 定义最终 Fault ID/命名、检测条件、Qualification / Debounce、Recovery、Reaction、DTC 归属、严重度以及对 System State 的影响。</w:t>
             </w:r>
           </w:p>
         </w:tc>
@@ -11985,7 +11861,7 @@
           <w:b w:val="0"/>
           <w:sz w:val="21"/>
         </w:rPr>
-        <w:t>Fault Architecture / Fault List v0.1 当前暂缓；恢复时从 Node A Fault Detection 开始，按 Detection → Qualification → Reaction → Recovery → Reporting 逐项定义。</w:t>
+        <w:t>Node A / Node B Fault Detection 范围与责任边界已形成当前 BASELINE；下一步进入 Fault → System State / Reaction，随后再汇总并冻结正式 Fault List v0.1。</w:t>
       </w:r>
     </w:p>
     <w:p>

</xml_diff>